<commit_message>
Better typing, ignore some, iter content
</commit_message>
<xml_diff>
--- a/tests/examples/abc.docx
+++ b/tests/examples/abc.docx
@@ -4,11 +4,6 @@
   <w:body>
     <w:p>
       <w:pPr>
-        <w:pStyle w:val="a3"/>
-        <w:numPr>
-          <w:ilvl w:val="0"/>
-          <w:numId w:val="1"/>
-        </w:numPr>
         <w:rPr>
           <w:lang w:val="en-US"/>
         </w:rPr>
@@ -17,7 +12,7 @@
         <w:rPr>
           <w:lang w:val="en-US"/>
         </w:rPr>
-        <w:t>ABC</w:t>
+        <w:t>Hellow, World!</w:t>
       </w:r>
     </w:p>
     <w:sectPr>
@@ -30,127 +25,6 @@
 </w:document>
 </file>
 
-<file path=word/numbering.xml><?xml version="1.0" encoding="utf-8"?>
-<w:numbering xmlns:wpc="http://schemas.microsoft.com/office/word/2010/wordprocessingCanvas" xmlns:cx="http://schemas.microsoft.com/office/drawing/2014/chartex" xmlns:cx1="http://schemas.microsoft.com/office/drawing/2015/9/8/chartex" xmlns:cx2="http://schemas.microsoft.com/office/drawing/2015/10/21/chartex" xmlns:cx3="http://schemas.microsoft.com/office/drawing/2016/5/9/chartex" xmlns:cx4="http://schemas.microsoft.com/office/drawing/2016/5/10/chartex" xmlns:cx5="http://schemas.microsoft.com/office/drawing/2016/5/11/chartex" xmlns:cx6="http://schemas.microsoft.com/office/drawing/2016/5/12/chartex" xmlns:cx7="http://schemas.microsoft.com/office/drawing/2016/5/13/chartex" xmlns:cx8="http://schemas.microsoft.com/office/drawing/2016/5/14/chartex" xmlns:mc="http://schemas.openxmlformats.org/markup-compatibility/2006" xmlns:aink="http://schemas.microsoft.com/office/drawing/2016/ink" xmlns:am3d="http://schemas.microsoft.com/office/drawing/2017/model3d" xmlns:o="urn:schemas-microsoft-com:office:office" xmlns:r="http://schemas.openxmlformats.org/officeDocument/2006/relationships" xmlns:m="http://schemas.openxmlformats.org/officeDocument/2006/math" xmlns:v="urn:schemas-microsoft-com:vml" xmlns:wp14="http://schemas.microsoft.com/office/word/2010/wordprocessingDrawing" xmlns:wp="http://schemas.openxmlformats.org/drawingml/2006/wordprocessingDrawing" xmlns:w10="urn:schemas-microsoft-com:office:word" xmlns:w="http://schemas.openxmlformats.org/wordprocessingml/2006/main" xmlns:w14="http://schemas.microsoft.com/office/word/2010/wordml" xmlns:w15="http://schemas.microsoft.com/office/word/2012/wordml" xmlns:w16cex="http://schemas.microsoft.com/office/word/2018/wordml/cex" xmlns:w16cid="http://schemas.microsoft.com/office/word/2016/wordml/cid" xmlns:w16="http://schemas.microsoft.com/office/word/2018/wordml" xmlns:w16sdtdh="http://schemas.microsoft.com/office/word/2020/wordml/sdtdatahash" xmlns:w16se="http://schemas.microsoft.com/office/word/2015/wordml/symex" xmlns:wpg="http://schemas.microsoft.com/office/word/2010/wordprocessingGroup" xmlns:wpi="http://schemas.microsoft.com/office/word/2010/wordprocessingInk" xmlns:wne="http://schemas.microsoft.com/office/word/2006/wordml" xmlns:wps="http://schemas.microsoft.com/office/word/2010/wordprocessingShape" mc:Ignorable="w14 w15 w16se w16cid w16 w16cex w16sdtdh wp14">
-  <w:abstractNum w:abstractNumId="0" w15:restartNumberingAfterBreak="0">
-    <w:nsid w:val="5F0F1AF4"/>
-    <w:multiLevelType w:val="hybridMultilevel"/>
-    <w:tmpl w:val="8160B3BA"/>
-    <w:lvl w:ilvl="0" w:tplc="04190001">
-      <w:start w:val="1"/>
-      <w:numFmt w:val="bullet"/>
-      <w:lvlText w:val=""/>
-      <w:lvlJc w:val="left"/>
-      <w:pPr>
-        <w:ind w:left="720" w:hanging="360"/>
-      </w:pPr>
-      <w:rPr>
-        <w:rFonts w:ascii="Symbol" w:hAnsi="Symbol" w:hint="default"/>
-      </w:rPr>
-    </w:lvl>
-    <w:lvl w:ilvl="1" w:tplc="04190003" w:tentative="1">
-      <w:start w:val="1"/>
-      <w:numFmt w:val="bullet"/>
-      <w:lvlText w:val="o"/>
-      <w:lvlJc w:val="left"/>
-      <w:pPr>
-        <w:ind w:left="1440" w:hanging="360"/>
-      </w:pPr>
-      <w:rPr>
-        <w:rFonts w:ascii="Courier New" w:hAnsi="Courier New" w:cs="Courier New" w:hint="default"/>
-      </w:rPr>
-    </w:lvl>
-    <w:lvl w:ilvl="2" w:tplc="04190005" w:tentative="1">
-      <w:start w:val="1"/>
-      <w:numFmt w:val="bullet"/>
-      <w:lvlText w:val=""/>
-      <w:lvlJc w:val="left"/>
-      <w:pPr>
-        <w:ind w:left="2160" w:hanging="360"/>
-      </w:pPr>
-      <w:rPr>
-        <w:rFonts w:ascii="Wingdings" w:hAnsi="Wingdings" w:hint="default"/>
-      </w:rPr>
-    </w:lvl>
-    <w:lvl w:ilvl="3" w:tplc="04190001" w:tentative="1">
-      <w:start w:val="1"/>
-      <w:numFmt w:val="bullet"/>
-      <w:lvlText w:val=""/>
-      <w:lvlJc w:val="left"/>
-      <w:pPr>
-        <w:ind w:left="2880" w:hanging="360"/>
-      </w:pPr>
-      <w:rPr>
-        <w:rFonts w:ascii="Symbol" w:hAnsi="Symbol" w:hint="default"/>
-      </w:rPr>
-    </w:lvl>
-    <w:lvl w:ilvl="4" w:tplc="04190003" w:tentative="1">
-      <w:start w:val="1"/>
-      <w:numFmt w:val="bullet"/>
-      <w:lvlText w:val="o"/>
-      <w:lvlJc w:val="left"/>
-      <w:pPr>
-        <w:ind w:left="3600" w:hanging="360"/>
-      </w:pPr>
-      <w:rPr>
-        <w:rFonts w:ascii="Courier New" w:hAnsi="Courier New" w:cs="Courier New" w:hint="default"/>
-      </w:rPr>
-    </w:lvl>
-    <w:lvl w:ilvl="5" w:tplc="04190005" w:tentative="1">
-      <w:start w:val="1"/>
-      <w:numFmt w:val="bullet"/>
-      <w:lvlText w:val=""/>
-      <w:lvlJc w:val="left"/>
-      <w:pPr>
-        <w:ind w:left="4320" w:hanging="360"/>
-      </w:pPr>
-      <w:rPr>
-        <w:rFonts w:ascii="Wingdings" w:hAnsi="Wingdings" w:hint="default"/>
-      </w:rPr>
-    </w:lvl>
-    <w:lvl w:ilvl="6" w:tplc="04190001" w:tentative="1">
-      <w:start w:val="1"/>
-      <w:numFmt w:val="bullet"/>
-      <w:lvlText w:val=""/>
-      <w:lvlJc w:val="left"/>
-      <w:pPr>
-        <w:ind w:left="5040" w:hanging="360"/>
-      </w:pPr>
-      <w:rPr>
-        <w:rFonts w:ascii="Symbol" w:hAnsi="Symbol" w:hint="default"/>
-      </w:rPr>
-    </w:lvl>
-    <w:lvl w:ilvl="7" w:tplc="04190003" w:tentative="1">
-      <w:start w:val="1"/>
-      <w:numFmt w:val="bullet"/>
-      <w:lvlText w:val="o"/>
-      <w:lvlJc w:val="left"/>
-      <w:pPr>
-        <w:ind w:left="5760" w:hanging="360"/>
-      </w:pPr>
-      <w:rPr>
-        <w:rFonts w:ascii="Courier New" w:hAnsi="Courier New" w:cs="Courier New" w:hint="default"/>
-      </w:rPr>
-    </w:lvl>
-    <w:lvl w:ilvl="8" w:tplc="04190005" w:tentative="1">
-      <w:start w:val="1"/>
-      <w:numFmt w:val="bullet"/>
-      <w:lvlText w:val=""/>
-      <w:lvlJc w:val="left"/>
-      <w:pPr>
-        <w:ind w:left="6480" w:hanging="360"/>
-      </w:pPr>
-      <w:rPr>
-        <w:rFonts w:ascii="Wingdings" w:hAnsi="Wingdings" w:hint="default"/>
-      </w:rPr>
-    </w:lvl>
-  </w:abstractNum>
-  <w:num w:numId="1">
-    <w:abstractNumId w:val="0"/>
-  </w:num>
-</w:numbering>
-</file>
-
 <file path=word/styles.xml><?xml version="1.0" encoding="utf-8"?>
 <w:styles xmlns:mc="http://schemas.openxmlformats.org/markup-compatibility/2006" xmlns:r="http://schemas.openxmlformats.org/officeDocument/2006/relationships" xmlns:w="http://schemas.openxmlformats.org/wordprocessingml/2006/main" xmlns:w14="http://schemas.microsoft.com/office/word/2010/wordml" xmlns:w15="http://schemas.microsoft.com/office/word/2012/wordml" xmlns:w16cex="http://schemas.microsoft.com/office/word/2018/wordml/cex" xmlns:w16cid="http://schemas.microsoft.com/office/word/2016/wordml/cid" xmlns:w16="http://schemas.microsoft.com/office/word/2018/wordml" xmlns:w16sdtdh="http://schemas.microsoft.com/office/word/2020/wordml/sdtdatahash" xmlns:w16se="http://schemas.microsoft.com/office/word/2015/wordml/symex" mc:Ignorable="w14 w15 w16se w16cid w16 w16cex w16sdtdh">
   <w:docDefaults>
@@ -159,7 +33,7 @@
         <w:rFonts w:asciiTheme="minorHAnsi" w:eastAsiaTheme="minorHAnsi" w:hAnsiTheme="minorHAnsi" w:cstheme="minorBidi"/>
         <w:sz w:val="22"/>
         <w:szCs w:val="22"/>
-        <w:lang w:val="ru-RU" w:eastAsia="en-US" w:bidi="he-IL"/>
+        <w:lang w:val="ru-RU" w:eastAsia="en-US" w:bidi="ar-SA"/>
       </w:rPr>
     </w:rPrDefault>
     <w:pPrDefault>
@@ -549,10 +423,6 @@
   <w:style w:type="paragraph" w:default="1" w:styleId="a">
     <w:name w:val="Normal"/>
     <w:qFormat/>
-    <w:rsid w:val="00A1061E"/>
-    <w:pPr>
-      <w:spacing w:line="256" w:lineRule="auto"/>
-    </w:pPr>
   </w:style>
   <w:style w:type="character" w:default="1" w:styleId="a0">
     <w:name w:val="Default Paragraph Font"/>
@@ -580,17 +450,6 @@
     <w:uiPriority w:val="99"/>
     <w:semiHidden/>
     <w:unhideWhenUsed/>
-  </w:style>
-  <w:style w:type="paragraph" w:styleId="a3">
-    <w:name w:val="List Paragraph"/>
-    <w:basedOn w:val="a"/>
-    <w:uiPriority w:val="34"/>
-    <w:qFormat/>
-    <w:rsid w:val="00584ACA"/>
-    <w:pPr>
-      <w:ind w:left="720"/>
-      <w:contextualSpacing/>
-    </w:pPr>
   </w:style>
 </w:styles>
 </file>

</xml_diff>

<commit_message>
First steps to formattings
</commit_message>
<xml_diff>
--- a/tests/examples/abc.docx
+++ b/tests/examples/abc.docx
@@ -4,15 +4,17 @@
   <w:body>
     <w:p>
       <w:pPr>
-        <w:rPr>
-          <w:lang w:val="en-US"/>
-        </w:rPr>
+        <w:pStyle w:val="Italic"/>
       </w:pPr>
       <w:r>
         <w:rPr>
-          <w:lang w:val="en-US"/>
+          <w:i w:val="0"/>
+          <w:iCs/>
         </w:rPr>
-        <w:t>Hellow, World!</w:t>
+        <w:t>Hello</w:t>
+      </w:r>
+      <w:r>
+        <w:t>, World!</w:t>
       </w:r>
     </w:p>
     <w:sectPr>
@@ -451,6 +453,27 @@
     <w:semiHidden/>
     <w:unhideWhenUsed/>
   </w:style>
+  <w:style w:type="paragraph" w:customStyle="1" w:styleId="Italic">
+    <w:name w:val="Italic"/>
+    <w:basedOn w:val="a"/>
+    <w:link w:val="Italic0"/>
+    <w:qFormat/>
+    <w:rsid w:val="00EF60D5"/>
+    <w:rPr>
+      <w:i/>
+      <w:lang w:val="en-US"/>
+    </w:rPr>
+  </w:style>
+  <w:style w:type="character" w:customStyle="1" w:styleId="Italic0">
+    <w:name w:val="Italic Знак"/>
+    <w:basedOn w:val="a0"/>
+    <w:link w:val="Italic"/>
+    <w:rsid w:val="00EF60D5"/>
+    <w:rPr>
+      <w:i/>
+      <w:lang w:val="en-US"/>
+    </w:rPr>
+  </w:style>
 </w:styles>
 </file>
 

</xml_diff>

<commit_message>
New step - character style inheritance
</commit_message>
<xml_diff>
--- a/tests/examples/abc.docx
+++ b/tests/examples/abc.docx
@@ -3,15 +3,17 @@
 <w:document xmlns:wpc="http://schemas.microsoft.com/office/word/2010/wordprocessingCanvas" xmlns:cx="http://schemas.microsoft.com/office/drawing/2014/chartex" xmlns:cx1="http://schemas.microsoft.com/office/drawing/2015/9/8/chartex" xmlns:cx2="http://schemas.microsoft.com/office/drawing/2015/10/21/chartex" xmlns:cx3="http://schemas.microsoft.com/office/drawing/2016/5/9/chartex" xmlns:cx4="http://schemas.microsoft.com/office/drawing/2016/5/10/chartex" xmlns:cx5="http://schemas.microsoft.com/office/drawing/2016/5/11/chartex" xmlns:cx6="http://schemas.microsoft.com/office/drawing/2016/5/12/chartex" xmlns:cx7="http://schemas.microsoft.com/office/drawing/2016/5/13/chartex" xmlns:cx8="http://schemas.microsoft.com/office/drawing/2016/5/14/chartex" xmlns:mc="http://schemas.openxmlformats.org/markup-compatibility/2006" xmlns:aink="http://schemas.microsoft.com/office/drawing/2016/ink" xmlns:am3d="http://schemas.microsoft.com/office/drawing/2017/model3d" xmlns:o="urn:schemas-microsoft-com:office:office" xmlns:r="http://schemas.openxmlformats.org/officeDocument/2006/relationships" xmlns:m="http://schemas.openxmlformats.org/officeDocument/2006/math" xmlns:v="urn:schemas-microsoft-com:vml" xmlns:wp14="http://schemas.microsoft.com/office/word/2010/wordprocessingDrawing" xmlns:wp="http://schemas.openxmlformats.org/drawingml/2006/wordprocessingDrawing" xmlns:w10="urn:schemas-microsoft-com:office:word" xmlns:w="http://schemas.openxmlformats.org/wordprocessingml/2006/main" xmlns:w14="http://schemas.microsoft.com/office/word/2010/wordml" xmlns:w15="http://schemas.microsoft.com/office/word/2012/wordml" xmlns:w16cex="http://schemas.microsoft.com/office/word/2018/wordml/cex" xmlns:w16cid="http://schemas.microsoft.com/office/word/2016/wordml/cid" xmlns:w16="http://schemas.microsoft.com/office/word/2018/wordml" xmlns:w16sdtdh="http://schemas.microsoft.com/office/word/2020/wordml/sdtdatahash" xmlns:w16se="http://schemas.microsoft.com/office/word/2015/wordml/symex" xmlns:wpg="http://schemas.microsoft.com/office/word/2010/wordprocessingGroup" xmlns:wpi="http://schemas.microsoft.com/office/word/2010/wordprocessingInk" xmlns:wne="http://schemas.microsoft.com/office/word/2006/wordml" xmlns:wps="http://schemas.microsoft.com/office/word/2010/wordprocessingShape" mc:Ignorable="w14 w15 w16se w16cid w16 w16cex w16sdtdh wp14">
   <w:body>
     <w:p>
-      <w:pPr>
-        <w:pStyle w:val="Italic"/>
-      </w:pPr>
       <w:r>
         <w:rPr>
-          <w:i w:val="0"/>
+          <w:rStyle w:val="ItalicChar"/>
+        </w:rPr>
+        <w:t>Hell</w:t>
+      </w:r>
+      <w:r>
+        <w:rPr>
           <w:iCs/>
         </w:rPr>
-        <w:t>Hello</w:t>
+        <w:t>o</w:t>
       </w:r>
       <w:r>
         <w:t>, World!</w:t>
@@ -474,6 +476,17 @@
       <w:lang w:val="en-US"/>
     </w:rPr>
   </w:style>
+  <w:style w:type="character" w:customStyle="1" w:styleId="ItalicChar">
+    <w:name w:val="Italic Char"/>
+    <w:basedOn w:val="a0"/>
+    <w:uiPriority w:val="1"/>
+    <w:qFormat/>
+    <w:rsid w:val="00BA5EC0"/>
+    <w:rPr>
+      <w:i/>
+      <w:iCs/>
+    </w:rPr>
+  </w:style>
 </w:styles>
 </file>
 

</xml_diff>